<commit_message>
Release reproducibility package v1.0.3
</commit_message>
<xml_diff>
--- a/reference/supplementary_data/Supplementary_Methods.docx
+++ b/reference/supplementary_data/Supplementary_Methods.docx
@@ -54,7 +54,39 @@
         <w:spacing w:after="80" w:line="240" w:lineRule="auto"/>
       </w:pPr>
       <w:r>
-        <w:t>2. Discovery-cohort preprocessing and integration audit</w:t>
+        <w:t>2. Discovery-cohort sample processing, library preparation, and primary read processing</w:t>
+      </w:r>
+    </w:p>
+    <w:p>
+      <w:pPr>
+        <w:spacing w:after="80" w:line="240" w:lineRule="auto"/>
+      </w:pPr>
+      <w:r>
+        <w:t>Fresh keloid and normal-skin specimens were obtained from six unrelated individuals and transported on ice in sterile 1× DPBS. Tissues were minced on ice and digested in PBS containing 0.2% collagenase II, 10 µg/mL DNase I, and 5% fetal bovine serum at 37°C with shaking at 50 r.p.m. for approximately 40 min. Dissociated cells were collected at 20-min intervals, passed through a 40-µm nylon cell strainer, subjected to red blood cell lysis, and washed with 1× DPBS containing 2% fetal bovine serum. Cell viability was assessed by trypan-blue exclusion using a Countess II automated cell counter.</w:t>
+      </w:r>
+    </w:p>
+    <w:p>
+      <w:pPr>
+        <w:spacing w:after="80" w:line="240" w:lineRule="auto"/>
+      </w:pPr>
+      <w:r>
+        <w:t>Single-cell RNA-sequencing libraries were generated using the DNBelab C Series platform. Cell suspensions, capture beads, and oil were loaded into a C4 microfluidic cartridge for droplet generation, cell lysis, and mRNA capture. Following emulsion breakage and bead recovery, reverse transcription, second-strand synthesis, cDNA amplification, fragment selection, adapter ligation, sample barcoding, and library circularization were performed according to the manufacturer’s workflow. The resulting libraries were sequenced on the DNBSEQ-T7RS platform.</w:t>
+      </w:r>
+    </w:p>
+    <w:p>
+      <w:pPr>
+        <w:spacing w:after="80" w:line="240" w:lineRule="auto"/>
+      </w:pPr>
+      <w:r>
+        <w:t>Sequencing reads were processed using DNBC4tools v2.1.2 with manufacturer-recommended parameters. Reads were aligned to the human GRCh38 reference genome using STAR, followed by barcode and UMI processing and generation of sample-specific gene-by-cell count matrices. These matrices were used as input for the final Seurat workflow described below.</w:t>
+      </w:r>
+    </w:p>
+    <w:p>
+      <w:pPr>
+        <w:spacing w:after="80" w:line="240" w:lineRule="auto"/>
+      </w:pPr>
+      <w:r>
+        <w:t>3. Discovery-cohort preprocessing and integration audit</w:t>
       </w:r>
     </w:p>
     <w:p>
@@ -86,7 +118,7 @@
         <w:spacing w:after="80" w:line="240" w:lineRule="auto"/>
       </w:pPr>
       <w:r>
-        <w:t>3. Fibroblast purification and state annotation</w:t>
+        <w:t>4. Fibroblast purification and state annotation</w:t>
       </w:r>
     </w:p>
     <w:p>
@@ -110,7 +142,7 @@
         <w:spacing w:after="80" w:line="240" w:lineRule="auto"/>
       </w:pPr>
       <w:r>
-        <w:t>4. DDRTree construction, root selection, and pseudotime sensitivity</w:t>
+        <w:t>5. DDRTree construction, root selection, and pseudotime sensitivity</w:t>
       </w:r>
     </w:p>
     <w:p>
@@ -142,7 +174,7 @@
         <w:spacing w:after="80" w:line="240" w:lineRule="auto"/>
       </w:pPr>
       <w:r>
-        <w:t>5. Dynamic-gene discovery and tradeSeq</w:t>
+        <w:t>6. Dynamic-gene discovery and tradeSeq</w:t>
       </w:r>
     </w:p>
     <w:p>
@@ -178,7 +210,7 @@
         <w:spacing w:after="80" w:line="240" w:lineRule="auto"/>
       </w:pPr>
       <w:r>
-        <w:t>6. Clean-program definition and donor-aware robustness</w:t>
+        <w:t>7. Clean-program definition and donor-aware robustness</w:t>
       </w:r>
     </w:p>
     <w:p>
@@ -218,7 +250,7 @@
         <w:spacing w:after="80" w:line="240" w:lineRule="auto"/>
       </w:pPr>
       <w:r>
-        <w:t>7. Discovery-only WGCNA and sensitivity analyses</w:t>
+        <w:t>8. Discovery-only WGCNA and sensitivity analyses</w:t>
       </w:r>
     </w:p>
     <w:p>
@@ -250,7 +282,7 @@
         <w:spacing w:after="80" w:line="240" w:lineRule="auto"/>
       </w:pPr>
       <w:r>
-        <w:t>8. GSE191067 external single-cell reproducibility evaluation</w:t>
+        <w:t>9. GSE191067 external single-cell reproducibility evaluation</w:t>
       </w:r>
     </w:p>
     <w:p>
@@ -283,7 +315,7 @@
         <w:spacing w:after="80" w:line="240" w:lineRule="auto"/>
       </w:pPr>
       <w:r>
-        <w:t>9. Matched donor-state module preservation</w:t>
+        <w:t>10. Matched donor-state module preservation</w:t>
       </w:r>
     </w:p>
     <w:p>
@@ -307,7 +339,7 @@
         <w:spacing w:after="80" w:line="240" w:lineRule="auto"/>
       </w:pPr>
       <w:r>
-        <w:t>10. PRJNA813172 processing and bulk projection</w:t>
+        <w:t>11. PRJNA813172 processing and bulk projection</w:t>
       </w:r>
     </w:p>
     <w:p>
@@ -339,7 +371,7 @@
         <w:spacing w:after="80" w:line="240" w:lineRule="auto"/>
       </w:pPr>
       <w:r>
-        <w:t>11. ROC and precision-recall statistics</w:t>
+        <w:t>12. ROC and precision-recall statistics</w:t>
       </w:r>
     </w:p>
     <w:p>
@@ -367,7 +399,7 @@
         </w:rPr>
       </w:pPr>
       <w:r>
-        <w:t>12. Random seeds and principal software</w:t>
+        <w:t>13. Random seeds and principal software</w:t>
       </w:r>
     </w:p>
     <w:p>

</xml_diff>